<commit_message>
an working model of kubernetes and ingress together
</commit_message>
<xml_diff>
--- a/docs/docs.docx
+++ b/docs/docs.docx
@@ -323,7 +323,1047 @@
       </w:r>
     </w:p>
     <w:p/>
+    <w:p>
+      <w:r>
+        <w:lastRenderedPageBreak/>
+        <w:drawing>
+          <wp:inline distT="0" distB="0" distL="0" distR="0" wp14:anchorId="0A621F83" wp14:editId="1285BAB9">
+            <wp:extent cx="5731510" cy="4909820"/>
+            <wp:effectExtent l="0" t="0" r="2540" b="5080"/>
+            <wp:docPr id="233502590" name="Picture 1"/>
+            <wp:cNvGraphicFramePr>
+              <a:graphicFrameLocks xmlns:a="http://schemas.openxmlformats.org/drawingml/2006/main" noChangeAspect="1"/>
+            </wp:cNvGraphicFramePr>
+            <a:graphic xmlns:a="http://schemas.openxmlformats.org/drawingml/2006/main">
+              <a:graphicData uri="http://schemas.openxmlformats.org/drawingml/2006/picture">
+                <pic:pic xmlns:pic="http://schemas.openxmlformats.org/drawingml/2006/picture">
+                  <pic:nvPicPr>
+                    <pic:cNvPr id="233502590" name=""/>
+                    <pic:cNvPicPr/>
+                  </pic:nvPicPr>
+                  <pic:blipFill>
+                    <a:blip r:embed="rId8"/>
+                    <a:stretch>
+                      <a:fillRect/>
+                    </a:stretch>
+                  </pic:blipFill>
+                  <pic:spPr>
+                    <a:xfrm>
+                      <a:off x="0" y="0"/>
+                      <a:ext cx="5731510" cy="4909820"/>
+                    </a:xfrm>
+                    <a:prstGeom prst="rect">
+                      <a:avLst/>
+                    </a:prstGeom>
+                  </pic:spPr>
+                </pic:pic>
+              </a:graphicData>
+            </a:graphic>
+          </wp:inline>
+        </w:drawing>
+      </w:r>
+    </w:p>
     <w:p/>
+    <w:p/>
+    <w:p>
+      <w:proofErr w:type="spellStart"/>
+      <w:r>
+        <w:t>requests.get</w:t>
+      </w:r>
+      <w:proofErr w:type="spellEnd"/>
+      <w:r>
+        <w:t>("http://product-service")</w:t>
+      </w:r>
+      <w:r>
+        <w:br/>
+      </w:r>
+      <w:r>
+        <w:t>There is</w:t>
+      </w:r>
+    </w:p>
+    <w:p>
+      <w:r>
+        <w:rPr>
+          <w:rFonts w:ascii="Segoe UI Emoji" w:hAnsi="Segoe UI Emoji" w:cs="Segoe UI Emoji"/>
+        </w:rPr>
+        <w:t>❌</w:t>
+      </w:r>
+      <w:r>
+        <w:t xml:space="preserve"> No IP</w:t>
+      </w:r>
+    </w:p>
+    <w:p>
+      <w:r>
+        <w:rPr>
+          <w:rFonts w:ascii="Segoe UI Emoji" w:hAnsi="Segoe UI Emoji" w:cs="Segoe UI Emoji"/>
+        </w:rPr>
+        <w:t>❌</w:t>
+      </w:r>
+      <w:r>
+        <w:t xml:space="preserve"> No port</w:t>
+      </w:r>
+    </w:p>
+    <w:p>
+      <w:r>
+        <w:rPr>
+          <w:rFonts w:ascii="Segoe UI Emoji" w:hAnsi="Segoe UI Emoji" w:cs="Segoe UI Emoji"/>
+        </w:rPr>
+        <w:t>❌</w:t>
+      </w:r>
+      <w:r>
+        <w:t xml:space="preserve"> No localhost</w:t>
+      </w:r>
+    </w:p>
+    <w:p>
+      <w:r>
+        <w:t>Only</w:t>
+      </w:r>
+      <w:r>
+        <w:t xml:space="preserve"> </w:t>
+      </w:r>
+      <w:r>
+        <w:t>product-service</w:t>
+      </w:r>
+      <w:r>
+        <w:t xml:space="preserve"> </w:t>
+      </w:r>
+      <w:r>
+        <w:t>Why?</w:t>
+      </w:r>
+    </w:p>
+    <w:p>
+      <w:r>
+        <w:t>Because Kubernetes created DNS for us.</w:t>
+      </w:r>
+      <w:r>
+        <w:br/>
+      </w:r>
+      <w:r>
+        <w:br/>
+      </w:r>
+      <w:r>
+        <w:t xml:space="preserve">metadata: </w:t>
+      </w:r>
+      <w:r>
+        <w:br/>
+        <w:t xml:space="preserve">        </w:t>
+      </w:r>
+      <w:r>
+        <w:t>name: product-service</w:t>
+      </w:r>
+      <w:r>
+        <w:br/>
+      </w:r>
+      <w:r>
+        <w:br/>
+      </w:r>
+      <w:r>
+        <w:t>That becomes the DNS name.</w:t>
+      </w:r>
+    </w:p>
+    <w:p/>
+    <w:p>
+      <w:r>
+        <w:t>``````````````````````````````````````````````````````````````</w:t>
+      </w:r>
+    </w:p>
+    <w:p>
+      <w:r>
+        <w:t>How Does the Request Travel?</w:t>
+      </w:r>
+      <w:r>
+        <w:br/>
+      </w:r>
+      <w:r>
+        <w:br/>
+      </w:r>
+      <w:r>
+        <w:t xml:space="preserve">Browser ↓ </w:t>
+      </w:r>
+      <w:r>
+        <w:br/>
+      </w:r>
+      <w:r>
+        <w:t>User Service Pod ↓</w:t>
+      </w:r>
+      <w:r>
+        <w:br/>
+      </w:r>
+      <w:r>
+        <w:t xml:space="preserve"> DNS Lookup ↓ </w:t>
+      </w:r>
+      <w:r>
+        <w:br/>
+      </w:r>
+      <w:r>
+        <w:t>product-service ↓</w:t>
+      </w:r>
+      <w:r>
+        <w:br/>
+      </w:r>
+      <w:r>
+        <w:t xml:space="preserve"> </w:t>
+      </w:r>
+      <w:proofErr w:type="spellStart"/>
+      <w:r>
+        <w:t>ClusterIP</w:t>
+      </w:r>
+      <w:proofErr w:type="spellEnd"/>
+      <w:r>
+        <w:t xml:space="preserve"> ↓</w:t>
+      </w:r>
+      <w:r>
+        <w:br/>
+      </w:r>
+      <w:r>
+        <w:t xml:space="preserve"> Product Pod ↓ </w:t>
+      </w:r>
+      <w:r>
+        <w:br/>
+      </w:r>
+      <w:r>
+        <w:t>JSON Response ↓</w:t>
+      </w:r>
+      <w:r>
+        <w:br/>
+      </w:r>
+      <w:r>
+        <w:t xml:space="preserve"> User Service ↓</w:t>
+      </w:r>
+      <w:r>
+        <w:br/>
+      </w:r>
+      <w:r>
+        <w:t xml:space="preserve"> Browser</w:t>
+      </w:r>
+    </w:p>
+    <w:p/>
+    <w:p>
+      <w:r>
+        <w:t>`````````````````````````````````````````````````````````````````</w:t>
+      </w:r>
+    </w:p>
+    <w:p>
+      <w:pPr>
+        <w:rPr>
+          <w:b/>
+          <w:bCs/>
+        </w:rPr>
+      </w:pPr>
+      <w:r>
+        <w:rPr>
+          <w:b/>
+          <w:bCs/>
+        </w:rPr>
+        <w:t>You Just Experienced Three Kubernetes Superpowers</w:t>
+      </w:r>
+    </w:p>
+    <w:p>
+      <w:pPr>
+        <w:rPr>
+          <w:b/>
+          <w:bCs/>
+        </w:rPr>
+      </w:pPr>
+      <w:r>
+        <w:rPr>
+          <w:b/>
+          <w:bCs/>
+        </w:rPr>
+        <w:t>1. Service Discovery</w:t>
+      </w:r>
+    </w:p>
+    <w:p>
+      <w:r>
+        <w:t>Applications discover each other by name.</w:t>
+      </w:r>
+    </w:p>
+    <w:p>
+      <w:pPr>
+        <w:rPr>
+          <w:b/>
+          <w:bCs/>
+        </w:rPr>
+      </w:pPr>
+      <w:proofErr w:type="spellStart"/>
+      <w:r>
+        <w:rPr>
+          <w:b/>
+          <w:bCs/>
+        </w:rPr>
+        <w:t>requests.get</w:t>
+      </w:r>
+      <w:proofErr w:type="spellEnd"/>
+      <w:r>
+        <w:rPr>
+          <w:b/>
+          <w:bCs/>
+        </w:rPr>
+        <w:t>("http://product-service")</w:t>
+      </w:r>
+    </w:p>
+    <w:p>
+      <w:r>
+        <w:t>No IP addresses.</w:t>
+      </w:r>
+    </w:p>
+    <w:p>
+      <w:r>
+        <w:pict w14:anchorId="5E0D8A69">
+          <v:rect id="_x0000_i1037" style="width:0;height:1.5pt" o:hralign="center" o:hrstd="t" o:hr="t" fillcolor="#a0a0a0" stroked="f"/>
+        </w:pict>
+      </w:r>
+    </w:p>
+    <w:p>
+      <w:pPr>
+        <w:rPr>
+          <w:b/>
+          <w:bCs/>
+        </w:rPr>
+      </w:pPr>
+      <w:r>
+        <w:rPr>
+          <w:b/>
+          <w:bCs/>
+        </w:rPr>
+        <w:t>2. Load Balancing</w:t>
+      </w:r>
+    </w:p>
+    <w:p>
+      <w:r>
+        <w:t>Every request goes to one healthy Product Pod.</w:t>
+      </w:r>
+    </w:p>
+    <w:p>
+      <w:r>
+        <w:t>User Service</w:t>
+      </w:r>
+    </w:p>
+    <w:p>
+      <w:r>
+        <w:t>↓</w:t>
+      </w:r>
+    </w:p>
+    <w:p>
+      <w:r>
+        <w:t>Product Service</w:t>
+      </w:r>
+    </w:p>
+    <w:p>
+      <w:r>
+        <w:t>↓</w:t>
+      </w:r>
+    </w:p>
+    <w:p>
+      <w:r>
+        <w:t>Pod A</w:t>
+      </w:r>
+    </w:p>
+    <w:p>
+      <w:r>
+        <w:t>Pod B</w:t>
+      </w:r>
+    </w:p>
+    <w:p>
+      <w:r>
+        <w:t>Pod C</w:t>
+      </w:r>
+    </w:p>
+    <w:p>
+      <w:r>
+        <w:pict w14:anchorId="4883D7FA">
+          <v:rect id="_x0000_i1038" style="width:0;height:1.5pt" o:hralign="center" o:hrstd="t" o:hr="t" fillcolor="#a0a0a0" stroked="f"/>
+        </w:pict>
+      </w:r>
+    </w:p>
+    <w:p>
+      <w:pPr>
+        <w:rPr>
+          <w:b/>
+          <w:bCs/>
+        </w:rPr>
+      </w:pPr>
+      <w:r>
+        <w:rPr>
+          <w:b/>
+          <w:bCs/>
+        </w:rPr>
+        <w:lastRenderedPageBreak/>
+        <w:t>3. Self-Healing</w:t>
+      </w:r>
+    </w:p>
+    <w:p>
+      <w:r>
+        <w:t>If Pod B dies</w:t>
+      </w:r>
+    </w:p>
+    <w:p>
+      <w:r>
+        <w:t>↓</w:t>
+      </w:r>
+    </w:p>
+    <w:p>
+      <w:proofErr w:type="spellStart"/>
+      <w:r>
+        <w:t>ReplicaSet</w:t>
+      </w:r>
+      <w:proofErr w:type="spellEnd"/>
+      <w:r>
+        <w:t xml:space="preserve"> creates a new one</w:t>
+      </w:r>
+    </w:p>
+    <w:p>
+      <w:r>
+        <w:t>↓</w:t>
+      </w:r>
+    </w:p>
+    <w:p>
+      <w:r>
+        <w:t>Service automatically starts using it</w:t>
+      </w:r>
+    </w:p>
+    <w:p>
+      <w:r>
+        <w:t>↓</w:t>
+      </w:r>
+    </w:p>
+    <w:p>
+      <w:r>
+        <w:t>User Service never notices</w:t>
+      </w:r>
+    </w:p>
+    <w:p/>
+    <w:p>
+      <w:r>
+        <w:t>```````````````````````````````````````````````````````````````````</w:t>
+      </w:r>
+    </w:p>
+    <w:p/>
+    <w:p>
+      <w:r>
+        <w:tab/>
+      </w:r>
+      <w:r>
+        <w:tab/>
+      </w:r>
+      <w:r>
+        <w:tab/>
+      </w:r>
+      <w:r>
+        <w:t>Phase 3 — Three Microservices</w:t>
+      </w:r>
+    </w:p>
+    <w:p/>
+    <w:p>
+      <w:r>
+        <w:drawing>
+          <wp:inline distT="0" distB="0" distL="0" distR="0" wp14:anchorId="6042901F" wp14:editId="73119107">
+            <wp:extent cx="5731510" cy="1413510"/>
+            <wp:effectExtent l="0" t="0" r="2540" b="0"/>
+            <wp:docPr id="1256633786" name="Picture 1"/>
+            <wp:cNvGraphicFramePr>
+              <a:graphicFrameLocks xmlns:a="http://schemas.openxmlformats.org/drawingml/2006/main" noChangeAspect="1"/>
+            </wp:cNvGraphicFramePr>
+            <a:graphic xmlns:a="http://schemas.openxmlformats.org/drawingml/2006/main">
+              <a:graphicData uri="http://schemas.openxmlformats.org/drawingml/2006/picture">
+                <pic:pic xmlns:pic="http://schemas.openxmlformats.org/drawingml/2006/picture">
+                  <pic:nvPicPr>
+                    <pic:cNvPr id="1256633786" name=""/>
+                    <pic:cNvPicPr/>
+                  </pic:nvPicPr>
+                  <pic:blipFill>
+                    <a:blip r:embed="rId9"/>
+                    <a:stretch>
+                      <a:fillRect/>
+                    </a:stretch>
+                  </pic:blipFill>
+                  <pic:spPr>
+                    <a:xfrm>
+                      <a:off x="0" y="0"/>
+                      <a:ext cx="5731510" cy="1413510"/>
+                    </a:xfrm>
+                    <a:prstGeom prst="rect">
+                      <a:avLst/>
+                    </a:prstGeom>
+                  </pic:spPr>
+                </pic:pic>
+              </a:graphicData>
+            </a:graphic>
+          </wp:inline>
+        </w:drawing>
+      </w:r>
+    </w:p>
+    <w:p>
+      <w:r>
+        <w:t xml:space="preserve">The </w:t>
+      </w:r>
+      <w:r>
+        <w:rPr>
+          <w:b/>
+          <w:bCs/>
+        </w:rPr>
+        <w:t>User Service</w:t>
+      </w:r>
+      <w:r>
+        <w:t xml:space="preserve"> becomes the </w:t>
+      </w:r>
+      <w:proofErr w:type="spellStart"/>
+      <w:proofErr w:type="gramStart"/>
+      <w:r>
+        <w:rPr>
+          <w:b/>
+          <w:bCs/>
+        </w:rPr>
+        <w:t>orchestrator</w:t>
+      </w:r>
+      <w:r>
+        <w:t>.It</w:t>
+      </w:r>
+      <w:proofErr w:type="spellEnd"/>
+      <w:proofErr w:type="gramEnd"/>
+      <w:r>
+        <w:t xml:space="preserve"> collects data from other services and sends one response back to the </w:t>
+      </w:r>
+      <w:proofErr w:type="spellStart"/>
+      <w:proofErr w:type="gramStart"/>
+      <w:r>
+        <w:t>browser.This</w:t>
+      </w:r>
+      <w:proofErr w:type="spellEnd"/>
+      <w:proofErr w:type="gramEnd"/>
+      <w:r>
+        <w:t xml:space="preserve"> is very common in production systems.</w:t>
+      </w:r>
+    </w:p>
+    <w:p/>
+    <w:p>
+      <w:r>
+        <w:t>One service coordinating multiple services.</w:t>
+      </w:r>
+    </w:p>
+    <w:p/>
+    <w:p>
+      <w:r>
+        <w:lastRenderedPageBreak/>
+        <w:drawing>
+          <wp:inline distT="0" distB="0" distL="0" distR="0" wp14:anchorId="779717C0" wp14:editId="59C273ED">
+            <wp:extent cx="5731510" cy="3415030"/>
+            <wp:effectExtent l="0" t="0" r="2540" b="0"/>
+            <wp:docPr id="2042740789" name="Picture 1"/>
+            <wp:cNvGraphicFramePr>
+              <a:graphicFrameLocks xmlns:a="http://schemas.openxmlformats.org/drawingml/2006/main" noChangeAspect="1"/>
+            </wp:cNvGraphicFramePr>
+            <a:graphic xmlns:a="http://schemas.openxmlformats.org/drawingml/2006/main">
+              <a:graphicData uri="http://schemas.openxmlformats.org/drawingml/2006/picture">
+                <pic:pic xmlns:pic="http://schemas.openxmlformats.org/drawingml/2006/picture">
+                  <pic:nvPicPr>
+                    <pic:cNvPr id="2042740789" name=""/>
+                    <pic:cNvPicPr/>
+                  </pic:nvPicPr>
+                  <pic:blipFill>
+                    <a:blip r:embed="rId10"/>
+                    <a:stretch>
+                      <a:fillRect/>
+                    </a:stretch>
+                  </pic:blipFill>
+                  <pic:spPr>
+                    <a:xfrm>
+                      <a:off x="0" y="0"/>
+                      <a:ext cx="5731510" cy="3415030"/>
+                    </a:xfrm>
+                    <a:prstGeom prst="rect">
+                      <a:avLst/>
+                    </a:prstGeom>
+                  </pic:spPr>
+                </pic:pic>
+              </a:graphicData>
+            </a:graphic>
+          </wp:inline>
+        </w:drawing>
+      </w:r>
+      <w:r>
+        <w:br/>
+      </w:r>
+      <w:r>
+        <w:t xml:space="preserve">Our User Service will play the role of that </w:t>
+      </w:r>
+      <w:r>
+        <w:rPr>
+          <w:b/>
+          <w:bCs/>
+        </w:rPr>
+        <w:t>Gateway Service</w:t>
+      </w:r>
+      <w:r>
+        <w:t>.</w:t>
+      </w:r>
+    </w:p>
+    <w:p/>
+    <w:p>
+      <w:r>
+        <w:drawing>
+          <wp:inline distT="0" distB="0" distL="0" distR="0" wp14:anchorId="6759D604" wp14:editId="05D6F3B5">
+            <wp:extent cx="5731510" cy="4434205"/>
+            <wp:effectExtent l="0" t="0" r="2540" b="4445"/>
+            <wp:docPr id="984653198" name="Picture 1"/>
+            <wp:cNvGraphicFramePr>
+              <a:graphicFrameLocks xmlns:a="http://schemas.openxmlformats.org/drawingml/2006/main" noChangeAspect="1"/>
+            </wp:cNvGraphicFramePr>
+            <a:graphic xmlns:a="http://schemas.openxmlformats.org/drawingml/2006/main">
+              <a:graphicData uri="http://schemas.openxmlformats.org/drawingml/2006/picture">
+                <pic:pic xmlns:pic="http://schemas.openxmlformats.org/drawingml/2006/picture">
+                  <pic:nvPicPr>
+                    <pic:cNvPr id="984653198" name=""/>
+                    <pic:cNvPicPr/>
+                  </pic:nvPicPr>
+                  <pic:blipFill>
+                    <a:blip r:embed="rId11"/>
+                    <a:stretch>
+                      <a:fillRect/>
+                    </a:stretch>
+                  </pic:blipFill>
+                  <pic:spPr>
+                    <a:xfrm>
+                      <a:off x="0" y="0"/>
+                      <a:ext cx="5731510" cy="4434205"/>
+                    </a:xfrm>
+                    <a:prstGeom prst="rect">
+                      <a:avLst/>
+                    </a:prstGeom>
+                  </pic:spPr>
+                </pic:pic>
+              </a:graphicData>
+            </a:graphic>
+          </wp:inline>
+        </w:drawing>
+      </w:r>
+      <w:r>
+        <w:br/>
+      </w:r>
+    </w:p>
+    <w:p>
+      <w:r>
+        <w:lastRenderedPageBreak/>
+        <w:t>```````````````````````````````````````````````````````````````````</w:t>
+      </w:r>
+    </w:p>
+    <w:p>
+      <w:r>
+        <w:tab/>
+      </w:r>
+      <w:r>
+        <w:tab/>
+      </w:r>
+      <w:r>
+        <w:tab/>
+      </w:r>
+      <w:r>
+        <w:tab/>
+        <w:t>INGINX CONROLLER PART</w:t>
+      </w:r>
+    </w:p>
+    <w:p/>
+    <w:p>
+      <w:pPr>
+        <w:rPr>
+          <w:b/>
+          <w:bCs/>
+        </w:rPr>
+      </w:pPr>
+      <w:r>
+        <w:drawing>
+          <wp:inline distT="0" distB="0" distL="0" distR="0" wp14:anchorId="2DA83FAF" wp14:editId="7FF6654B">
+            <wp:extent cx="5731510" cy="3883660"/>
+            <wp:effectExtent l="0" t="0" r="2540" b="2540"/>
+            <wp:docPr id="1974043882" name="Picture 1"/>
+            <wp:cNvGraphicFramePr>
+              <a:graphicFrameLocks xmlns:a="http://schemas.openxmlformats.org/drawingml/2006/main" noChangeAspect="1"/>
+            </wp:cNvGraphicFramePr>
+            <a:graphic xmlns:a="http://schemas.openxmlformats.org/drawingml/2006/main">
+              <a:graphicData uri="http://schemas.openxmlformats.org/drawingml/2006/picture">
+                <pic:pic xmlns:pic="http://schemas.openxmlformats.org/drawingml/2006/picture">
+                  <pic:nvPicPr>
+                    <pic:cNvPr id="1974043882" name=""/>
+                    <pic:cNvPicPr/>
+                  </pic:nvPicPr>
+                  <pic:blipFill>
+                    <a:blip r:embed="rId12"/>
+                    <a:stretch>
+                      <a:fillRect/>
+                    </a:stretch>
+                  </pic:blipFill>
+                  <pic:spPr>
+                    <a:xfrm>
+                      <a:off x="0" y="0"/>
+                      <a:ext cx="5731510" cy="3883660"/>
+                    </a:xfrm>
+                    <a:prstGeom prst="rect">
+                      <a:avLst/>
+                    </a:prstGeom>
+                  </pic:spPr>
+                </pic:pic>
+              </a:graphicData>
+            </a:graphic>
+          </wp:inline>
+        </w:drawing>
+      </w:r>
+      <w:r>
+        <w:br/>
+      </w:r>
+      <w:r>
+        <w:rPr>
+          <w:b/>
+          <w:bCs/>
+        </w:rPr>
+        <w:t>Stage 2 — Multiple Services</w:t>
+      </w:r>
+    </w:p>
+    <w:p>
+      <w:r>
+        <w:t>Then we built:</w:t>
+      </w:r>
+    </w:p>
+    <w:p/>
+    <w:p>
+      <w:r>
+        <w:t>Browser</w:t>
+      </w:r>
+    </w:p>
+    <w:p>
+      <w:r>
+        <w:t xml:space="preserve">    </w:t>
+      </w:r>
+      <w:r>
+        <w:rPr>
+          <w:rFonts w:ascii="Arial" w:hAnsi="Arial" w:cs="Arial"/>
+        </w:rPr>
+        <w:t>▼</w:t>
+      </w:r>
+    </w:p>
+    <w:p>
+      <w:r>
+        <w:t>User Service</w:t>
+      </w:r>
+    </w:p>
+    <w:p>
+      <w:r>
+        <w:t xml:space="preserve">    </w:t>
+      </w:r>
+      <w:r>
+        <w:rPr>
+          <w:rFonts w:ascii="Arial" w:hAnsi="Arial" w:cs="Arial"/>
+        </w:rPr>
+        <w:t>▼</w:t>
+      </w:r>
+    </w:p>
+    <w:p>
+      <w:r>
+        <w:t>Product Service</w:t>
+      </w:r>
+      <w:r>
+        <w:br/>
+      </w:r>
+    </w:p>
+    <w:p>
+      <w:r>
+        <w:t>Now ask yourself:</w:t>
+      </w:r>
+    </w:p>
+    <w:p>
+      <w:r>
+        <w:rPr>
+          <w:b/>
+          <w:bCs/>
+        </w:rPr>
+        <w:t>Does the browser really need to know about Product Service?</w:t>
+      </w:r>
+    </w:p>
+    <w:p>
+      <w:r>
+        <w:t>No.</w:t>
+      </w:r>
+    </w:p>
+    <w:p>
+      <w:r>
+        <w:t>The browser only wants:</w:t>
+      </w:r>
+    </w:p>
+    <w:p>
+      <w:r>
+        <w:lastRenderedPageBreak/>
+        <w:t>"Give me product information."</w:t>
+      </w:r>
+    </w:p>
+    <w:p>
+      <w:r>
+        <w:t xml:space="preserve">It doesn't care </w:t>
+      </w:r>
+      <w:r>
+        <w:rPr>
+          <w:b/>
+          <w:bCs/>
+        </w:rPr>
+        <w:t>where</w:t>
+      </w:r>
+      <w:r>
+        <w:t xml:space="preserve"> that information comes from.</w:t>
+      </w:r>
+    </w:p>
+    <w:p>
+      <w:proofErr w:type="gramStart"/>
+      <w:r>
+        <w:t>So</w:t>
+      </w:r>
+      <w:proofErr w:type="gramEnd"/>
+      <w:r>
+        <w:t xml:space="preserve"> the User Service asks the Product Service internally.</w:t>
+      </w:r>
+      <w:r>
+        <w:br/>
+      </w:r>
+    </w:p>
+    <w:p>
+      <w:r>
+        <w:t>Browser</w:t>
+      </w:r>
+    </w:p>
+    <w:p>
+      <w:r>
+        <w:t xml:space="preserve">    </w:t>
+      </w:r>
+      <w:r>
+        <w:rPr>
+          <w:rFonts w:ascii="Arial" w:hAnsi="Arial" w:cs="Arial"/>
+        </w:rPr>
+        <w:t>▼</w:t>
+      </w:r>
+    </w:p>
+    <w:p>
+      <w:r>
+        <w:t>User Service</w:t>
+      </w:r>
+    </w:p>
+    <w:p>
+      <w:r>
+        <w:t xml:space="preserve">    </w:t>
+      </w:r>
+      <w:r>
+        <w:rPr>
+          <w:rFonts w:ascii="Arial" w:hAnsi="Arial" w:cs="Arial"/>
+        </w:rPr>
+        <w:t>▼</w:t>
+      </w:r>
+    </w:p>
+    <w:p>
+      <w:r>
+        <w:t>Product Service</w:t>
+      </w:r>
+    </w:p>
+    <w:p>
+      <w:r>
+        <w:br/>
+      </w:r>
+      <w:r>
+        <w:t>Notice:</w:t>
+      </w:r>
+    </w:p>
+    <w:p>
+      <w:r>
+        <w:t xml:space="preserve">The Product Service is now an </w:t>
+      </w:r>
+      <w:r>
+        <w:rPr>
+          <w:b/>
+          <w:bCs/>
+        </w:rPr>
+        <w:t>internal service</w:t>
+      </w:r>
+      <w:r>
+        <w:t>.</w:t>
+      </w:r>
+    </w:p>
+    <w:p>
+      <w:r>
+        <w:t xml:space="preserve">That's why we used </w:t>
+      </w:r>
+      <w:proofErr w:type="spellStart"/>
+      <w:r>
+        <w:rPr>
+          <w:b/>
+          <w:bCs/>
+        </w:rPr>
+        <w:t>ClusterIP</w:t>
+      </w:r>
+      <w:proofErr w:type="spellEnd"/>
+      <w:r>
+        <w:t>.</w:t>
+      </w:r>
+    </w:p>
+    <w:p/>
+    <w:p>
+      <w:r>
+        <w:lastRenderedPageBreak/>
+        <w:drawing>
+          <wp:inline distT="0" distB="0" distL="0" distR="0" wp14:anchorId="251AC687" wp14:editId="1DE5CFD3">
+            <wp:extent cx="5731510" cy="4284345"/>
+            <wp:effectExtent l="0" t="0" r="2540" b="1905"/>
+            <wp:docPr id="1662636003" name="Picture 1"/>
+            <wp:cNvGraphicFramePr>
+              <a:graphicFrameLocks xmlns:a="http://schemas.openxmlformats.org/drawingml/2006/main" noChangeAspect="1"/>
+            </wp:cNvGraphicFramePr>
+            <a:graphic xmlns:a="http://schemas.openxmlformats.org/drawingml/2006/main">
+              <a:graphicData uri="http://schemas.openxmlformats.org/drawingml/2006/picture">
+                <pic:pic xmlns:pic="http://schemas.openxmlformats.org/drawingml/2006/picture">
+                  <pic:nvPicPr>
+                    <pic:cNvPr id="1662636003" name=""/>
+                    <pic:cNvPicPr/>
+                  </pic:nvPicPr>
+                  <pic:blipFill>
+                    <a:blip r:embed="rId13"/>
+                    <a:stretch>
+                      <a:fillRect/>
+                    </a:stretch>
+                  </pic:blipFill>
+                  <pic:spPr>
+                    <a:xfrm>
+                      <a:off x="0" y="0"/>
+                      <a:ext cx="5731510" cy="4284345"/>
+                    </a:xfrm>
+                    <a:prstGeom prst="rect">
+                      <a:avLst/>
+                    </a:prstGeom>
+                  </pic:spPr>
+                </pic:pic>
+              </a:graphicData>
+            </a:graphic>
+          </wp:inline>
+        </w:drawing>
+      </w:r>
+      <w:r>
+        <w:br/>
+      </w:r>
+      <w:r>
+        <w:drawing>
+          <wp:inline distT="0" distB="0" distL="0" distR="0" wp14:anchorId="15034C8C" wp14:editId="17311449">
+            <wp:extent cx="5731510" cy="3425190"/>
+            <wp:effectExtent l="0" t="0" r="2540" b="3810"/>
+            <wp:docPr id="2066064116" name="Picture 1"/>
+            <wp:cNvGraphicFramePr>
+              <a:graphicFrameLocks xmlns:a="http://schemas.openxmlformats.org/drawingml/2006/main" noChangeAspect="1"/>
+            </wp:cNvGraphicFramePr>
+            <a:graphic xmlns:a="http://schemas.openxmlformats.org/drawingml/2006/main">
+              <a:graphicData uri="http://schemas.openxmlformats.org/drawingml/2006/picture">
+                <pic:pic xmlns:pic="http://schemas.openxmlformats.org/drawingml/2006/picture">
+                  <pic:nvPicPr>
+                    <pic:cNvPr id="2066064116" name=""/>
+                    <pic:cNvPicPr/>
+                  </pic:nvPicPr>
+                  <pic:blipFill>
+                    <a:blip r:embed="rId14"/>
+                    <a:stretch>
+                      <a:fillRect/>
+                    </a:stretch>
+                  </pic:blipFill>
+                  <pic:spPr>
+                    <a:xfrm>
+                      <a:off x="0" y="0"/>
+                      <a:ext cx="5731510" cy="3425190"/>
+                    </a:xfrm>
+                    <a:prstGeom prst="rect">
+                      <a:avLst/>
+                    </a:prstGeom>
+                  </pic:spPr>
+                </pic:pic>
+              </a:graphicData>
+            </a:graphic>
+          </wp:inline>
+        </w:drawing>
+      </w:r>
+      <w:r>
+        <w:br/>
+      </w:r>
+      <w:r>
+        <w:lastRenderedPageBreak/>
+        <w:drawing>
+          <wp:inline distT="0" distB="0" distL="0" distR="0" wp14:anchorId="5C9A2220" wp14:editId="14602A49">
+            <wp:extent cx="5731510" cy="2350135"/>
+            <wp:effectExtent l="0" t="0" r="2540" b="0"/>
+            <wp:docPr id="215453746" name="Picture 1"/>
+            <wp:cNvGraphicFramePr>
+              <a:graphicFrameLocks xmlns:a="http://schemas.openxmlformats.org/drawingml/2006/main" noChangeAspect="1"/>
+            </wp:cNvGraphicFramePr>
+            <a:graphic xmlns:a="http://schemas.openxmlformats.org/drawingml/2006/main">
+              <a:graphicData uri="http://schemas.openxmlformats.org/drawingml/2006/picture">
+                <pic:pic xmlns:pic="http://schemas.openxmlformats.org/drawingml/2006/picture">
+                  <pic:nvPicPr>
+                    <pic:cNvPr id="215453746" name=""/>
+                    <pic:cNvPicPr/>
+                  </pic:nvPicPr>
+                  <pic:blipFill>
+                    <a:blip r:embed="rId15"/>
+                    <a:stretch>
+                      <a:fillRect/>
+                    </a:stretch>
+                  </pic:blipFill>
+                  <pic:spPr>
+                    <a:xfrm>
+                      <a:off x="0" y="0"/>
+                      <a:ext cx="5731510" cy="2350135"/>
+                    </a:xfrm>
+                    <a:prstGeom prst="rect">
+                      <a:avLst/>
+                    </a:prstGeom>
+                  </pic:spPr>
+                </pic:pic>
+              </a:graphicData>
+            </a:graphic>
+          </wp:inline>
+        </w:drawing>
+      </w:r>
+      <w:r>
+        <w:br/>
+        <w:t>```````````````````````````````````````````````````````````````````</w:t>
+      </w:r>
+    </w:p>
+    <w:p/>
+    <w:p>
+      <w:pPr>
+        <w:rPr>
+          <w:b/>
+          <w:bCs/>
+        </w:rPr>
+      </w:pPr>
+      <w:r>
+        <w:rPr>
+          <w:b/>
+          <w:bCs/>
+        </w:rPr>
+        <w:t xml:space="preserve">Once we introduce Ingress, even the User Service can become a </w:t>
+      </w:r>
+      <w:proofErr w:type="spellStart"/>
+      <w:r>
+        <w:rPr>
+          <w:b/>
+          <w:bCs/>
+        </w:rPr>
+        <w:t>ClusterIP</w:t>
+      </w:r>
+      <w:proofErr w:type="spellEnd"/>
+      <w:r>
+        <w:rPr>
+          <w:b/>
+          <w:bCs/>
+        </w:rPr>
+        <w:t xml:space="preserve"> Service, because Ingress will be the only public entry point into the cluster.</w:t>
+      </w:r>
+      <w:r>
+        <w:rPr>
+          <w:b/>
+          <w:bCs/>
+        </w:rPr>
+        <w:br/>
+      </w:r>
+    </w:p>
     <w:p/>
     <w:sectPr>
       <w:pgSz w:w="11906" w:h="16838"/>

</xml_diff>

<commit_message>
Expiriment 1 ( readeness and liveness )
</commit_message>
<xml_diff>
--- a/docs/docs.docx
+++ b/docs/docs.docx
@@ -826,6 +826,7 @@
         <w:t xml:space="preserve"> becomes the </w:t>
       </w:r>
       <w:proofErr w:type="spellStart"/>
+      <w:proofErr w:type="gramStart"/>
       <w:r>
         <w:rPr>
           <w:b/>
@@ -837,14 +838,17 @@
         <w:t>.It</w:t>
       </w:r>
       <w:proofErr w:type="spellEnd"/>
+      <w:proofErr w:type="gramEnd"/>
       <w:r>
         <w:t xml:space="preserve"> collects data from other services and sends one response back to the </w:t>
       </w:r>
       <w:proofErr w:type="spellStart"/>
+      <w:proofErr w:type="gramStart"/>
       <w:r>
         <w:t>browser.This</w:t>
       </w:r>
       <w:proofErr w:type="spellEnd"/>
+      <w:proofErr w:type="gramEnd"/>
       <w:r>
         <w:t xml:space="preserve"> is very common in production systems.</w:t>
       </w:r>
@@ -1133,8 +1137,13 @@
       </w:r>
     </w:p>
     <w:p>
-      <w:r>
-        <w:t>So the User Service asks the Product Service internally.</w:t>
+      <w:proofErr w:type="gramStart"/>
+      <w:r>
+        <w:t>So</w:t>
+      </w:r>
+      <w:proofErr w:type="gramEnd"/>
+      <w:r>
+        <w:t xml:space="preserve"> the User Service asks the Product Service internally.</w:t>
       </w:r>
       <w:r>
         <w:br/>
@@ -1466,10 +1475,22 @@
           <w:b/>
           <w:bCs/>
         </w:rPr>
-        <w:t>. Ingress Resource</w:t>
-      </w:r>
-      <w:r>
-        <w:t xml:space="preserve"> : </w:t>
+        <w:t xml:space="preserve">. Ingress </w:t>
+      </w:r>
+      <w:proofErr w:type="gramStart"/>
+      <w:r>
+        <w:rPr>
+          <w:b/>
+          <w:bCs/>
+        </w:rPr>
+        <w:t>Resource</w:t>
+      </w:r>
+      <w:r>
+        <w:t xml:space="preserve"> :</w:t>
+      </w:r>
+      <w:proofErr w:type="gramEnd"/>
+      <w:r>
+        <w:t xml:space="preserve"> </w:t>
       </w:r>
       <w:r>
         <w:t>This is just a YAML file</w:t>
@@ -1477,8 +1498,13 @@
       <w:r>
         <w:t xml:space="preserve">, </w:t>
       </w:r>
-      <w:r>
-        <w:t xml:space="preserve">It contains </w:t>
+      <w:proofErr w:type="gramStart"/>
+      <w:r>
+        <w:t>It</w:t>
+      </w:r>
+      <w:proofErr w:type="gramEnd"/>
+      <w:r>
+        <w:t xml:space="preserve"> contains </w:t>
       </w:r>
       <w:r>
         <w:rPr>
@@ -1488,6 +1514,7 @@
         <w:t xml:space="preserve">rules </w:t>
       </w:r>
       <w:proofErr w:type="spellStart"/>
+      <w:proofErr w:type="gramStart"/>
       <w:r>
         <w:rPr>
           <w:b/>
@@ -1499,6 +1526,7 @@
         <w:t>.It</w:t>
       </w:r>
       <w:proofErr w:type="spellEnd"/>
+      <w:proofErr w:type="gramEnd"/>
       <w:r>
         <w:t xml:space="preserve"> cannot receive traffic.</w:t>
       </w:r>
@@ -1515,14 +1543,30 @@
           <w:b/>
           <w:bCs/>
         </w:rPr>
-        <w:t>. Ingress Controller</w:t>
-      </w:r>
-      <w:r>
-        <w:rPr>
-          <w:b/>
-          <w:bCs/>
-        </w:rPr>
-        <w:t xml:space="preserve"> : </w:t>
+        <w:t xml:space="preserve">. Ingress </w:t>
+      </w:r>
+      <w:proofErr w:type="gramStart"/>
+      <w:r>
+        <w:rPr>
+          <w:b/>
+          <w:bCs/>
+        </w:rPr>
+        <w:t>Controller</w:t>
+      </w:r>
+      <w:r>
+        <w:rPr>
+          <w:b/>
+          <w:bCs/>
+        </w:rPr>
+        <w:t xml:space="preserve"> :</w:t>
+      </w:r>
+      <w:proofErr w:type="gramEnd"/>
+      <w:r>
+        <w:rPr>
+          <w:b/>
+          <w:bCs/>
+        </w:rPr>
+        <w:t xml:space="preserve"> </w:t>
       </w:r>
       <w:r>
         <w:t>This is an actual application. running inside Kubernetes. It reads the rules from the YAML and routes the traffic.</w:t>
@@ -1581,7 +1625,23 @@
     <w:p>
       <w:r>
         <w:lastRenderedPageBreak/>
-        <w:t xml:space="preserve">Latest architecture as user services sit after ingress controller , where ingress controller does not interact with product or general services </w:t>
+        <w:t xml:space="preserve">Latest architecture as user services </w:t>
+      </w:r>
+      <w:proofErr w:type="gramStart"/>
+      <w:r>
+        <w:t>sit</w:t>
+      </w:r>
+      <w:proofErr w:type="gramEnd"/>
+      <w:r>
+        <w:t xml:space="preserve"> after ingress </w:t>
+      </w:r>
+      <w:proofErr w:type="gramStart"/>
+      <w:r>
+        <w:t>controller ,</w:t>
+      </w:r>
+      <w:proofErr w:type="gramEnd"/>
+      <w:r>
+        <w:t xml:space="preserve"> where ingress controller does not interact with product or general services </w:t>
       </w:r>
       <w:r>
         <w:br/>
@@ -1712,10 +1772,17 @@
       </w:r>
       <w:r>
         <w:br/>
+      </w:r>
+      <w:proofErr w:type="gramStart"/>
+      <w:r>
         <w:t>S</w:t>
       </w:r>
       <w:r>
-        <w:t>o we separate them.</w:t>
+        <w:t>o</w:t>
+      </w:r>
+      <w:proofErr w:type="gramEnd"/>
+      <w:r>
+        <w:t xml:space="preserve"> we separate them.</w:t>
       </w:r>
     </w:p>
     <w:p/>
@@ -1765,6 +1832,9 @@
         <w:br/>
       </w:r>
       <w:r>
+        <w:rPr>
+          <w:noProof/>
+        </w:rPr>
         <w:lastRenderedPageBreak/>
         <w:drawing>
           <wp:inline distT="0" distB="0" distL="0" distR="0" wp14:anchorId="5D631A75" wp14:editId="50636062">
@@ -1806,6 +1876,9 @@
         <w:br/>
       </w:r>
       <w:r>
+        <w:rPr>
+          <w:noProof/>
+        </w:rPr>
         <w:drawing>
           <wp:inline distT="0" distB="0" distL="0" distR="0" wp14:anchorId="4294953C" wp14:editId="0270F07C">
             <wp:extent cx="5731510" cy="3710305"/>
@@ -1846,6 +1919,9 @@
         <w:br/>
       </w:r>
       <w:r>
+        <w:rPr>
+          <w:noProof/>
+        </w:rPr>
         <w:lastRenderedPageBreak/>
         <w:drawing>
           <wp:inline distT="0" distB="0" distL="0" distR="0" wp14:anchorId="12E658BE" wp14:editId="31CBDCC0">
@@ -1915,6 +1991,9 @@
         <w:br/>
       </w:r>
       <w:r>
+        <w:rPr>
+          <w:noProof/>
+        </w:rPr>
         <w:drawing>
           <wp:inline distT="0" distB="0" distL="0" distR="0" wp14:anchorId="73469545" wp14:editId="75D9780A">
             <wp:extent cx="5201376" cy="743054"/>
@@ -1990,6 +2069,7 @@
         <w:t xml:space="preserve"> from that general-</w:t>
       </w:r>
       <w:proofErr w:type="spellStart"/>
+      <w:proofErr w:type="gramStart"/>
       <w:r>
         <w:t>cofig</w:t>
       </w:r>
@@ -1997,6 +2077,7 @@
       <w:r>
         <w:t xml:space="preserve"> .</w:t>
       </w:r>
+      <w:proofErr w:type="gramEnd"/>
     </w:p>
     <w:p>
       <w:r>
@@ -2025,18 +2106,15 @@
       </w:r>
       <w:proofErr w:type="spellEnd"/>
       <w:r>
-        <w:t xml:space="preserve"> anymore during execution</w:t>
-      </w:r>
-      <w:r>
-        <w:t xml:space="preserve">. </w:t>
-      </w:r>
-      <w:r>
-        <w:t>It is now part of the container's environment.</w:t>
+        <w:t xml:space="preserve"> anymore during execution. It is now part of the container's environment.</w:t>
       </w:r>
     </w:p>
     <w:p/>
     <w:p>
       <w:r>
+        <w:rPr>
+          <w:noProof/>
+        </w:rPr>
         <w:lastRenderedPageBreak/>
         <w:drawing>
           <wp:inline distT="0" distB="0" distL="0" distR="0" wp14:anchorId="6E8D2096" wp14:editId="003AA7D2">
@@ -2083,6 +2161,9 @@
         <w:br/>
       </w:r>
       <w:r>
+        <w:rPr>
+          <w:noProof/>
+        </w:rPr>
         <w:drawing>
           <wp:inline distT="0" distB="0" distL="0" distR="0" wp14:anchorId="0BE1AC34" wp14:editId="35DC4A47">
             <wp:extent cx="5731510" cy="3495040"/>
@@ -2123,6 +2204,985 @@
         <w:br/>
       </w:r>
     </w:p>
+    <w:p>
+      <w:r>
+        <w:lastRenderedPageBreak/>
+        <w:t>`````````````````````````````````````````````````````````````````</w:t>
+      </w:r>
+    </w:p>
+    <w:p>
+      <w:pPr>
+        <w:rPr>
+          <w:b/>
+          <w:bCs/>
+        </w:rPr>
+      </w:pPr>
+      <w:r>
+        <w:tab/>
+      </w:r>
+      <w:r>
+        <w:tab/>
+      </w:r>
+      <w:r>
+        <w:tab/>
+      </w:r>
+      <w:r>
+        <w:tab/>
+      </w:r>
+      <w:r>
+        <w:rPr>
+          <w:b/>
+          <w:bCs/>
+        </w:rPr>
+        <w:t>SECRETS</w:t>
+      </w:r>
+    </w:p>
+    <w:p>
+      <w:pPr>
+        <w:rPr>
+          <w:b/>
+          <w:bCs/>
+        </w:rPr>
+      </w:pPr>
+    </w:p>
+    <w:p>
+      <w:r>
+        <w:t xml:space="preserve">Secrets are almost identical to </w:t>
+      </w:r>
+      <w:proofErr w:type="spellStart"/>
+      <w:r>
+        <w:t>ConfigMaps</w:t>
+      </w:r>
+      <w:proofErr w:type="spellEnd"/>
+      <w:r>
+        <w:t>.</w:t>
+      </w:r>
+      <w:r>
+        <w:t xml:space="preserve"> </w:t>
+      </w:r>
+      <w:r>
+        <w:t xml:space="preserve">The only difference is </w:t>
+      </w:r>
+      <w:r>
+        <w:rPr>
+          <w:b/>
+          <w:bCs/>
+        </w:rPr>
+        <w:t>what kind of data they are meant to store</w:t>
+      </w:r>
+      <w:r>
+        <w:t>.</w:t>
+      </w:r>
+    </w:p>
+    <w:p>
+      <w:r>
+        <w:t>there is another object</w:t>
+      </w:r>
+      <w:r>
+        <w:t xml:space="preserve"> </w:t>
+      </w:r>
+      <w:proofErr w:type="gramStart"/>
+      <w:r>
+        <w:t>SECRETS ,</w:t>
+      </w:r>
+      <w:proofErr w:type="gramEnd"/>
+      <w:r>
+        <w:br/>
+      </w:r>
+      <w:r>
+        <w:drawing>
+          <wp:inline distT="0" distB="0" distL="0" distR="0" wp14:anchorId="2305D8B1" wp14:editId="02A78767">
+            <wp:extent cx="5731510" cy="1553845"/>
+            <wp:effectExtent l="0" t="0" r="2540" b="8255"/>
+            <wp:docPr id="397405687" name="Picture 1"/>
+            <wp:cNvGraphicFramePr>
+              <a:graphicFrameLocks xmlns:a="http://schemas.openxmlformats.org/drawingml/2006/main" noChangeAspect="1"/>
+            </wp:cNvGraphicFramePr>
+            <a:graphic xmlns:a="http://schemas.openxmlformats.org/drawingml/2006/main">
+              <a:graphicData uri="http://schemas.openxmlformats.org/drawingml/2006/picture">
+                <pic:pic xmlns:pic="http://schemas.openxmlformats.org/drawingml/2006/picture">
+                  <pic:nvPicPr>
+                    <pic:cNvPr id="397405687" name=""/>
+                    <pic:cNvPicPr/>
+                  </pic:nvPicPr>
+                  <pic:blipFill>
+                    <a:blip r:embed="rId27"/>
+                    <a:stretch>
+                      <a:fillRect/>
+                    </a:stretch>
+                  </pic:blipFill>
+                  <pic:spPr>
+                    <a:xfrm>
+                      <a:off x="0" y="0"/>
+                      <a:ext cx="5731510" cy="1553845"/>
+                    </a:xfrm>
+                    <a:prstGeom prst="rect">
+                      <a:avLst/>
+                    </a:prstGeom>
+                  </pic:spPr>
+                </pic:pic>
+              </a:graphicData>
+            </a:graphic>
+          </wp:inline>
+        </w:drawing>
+      </w:r>
+    </w:p>
+    <w:p>
+      <w:r>
+        <w:drawing>
+          <wp:inline distT="0" distB="0" distL="0" distR="0" wp14:anchorId="75776C24" wp14:editId="2C3018E2">
+            <wp:extent cx="5731510" cy="1893570"/>
+            <wp:effectExtent l="0" t="0" r="2540" b="0"/>
+            <wp:docPr id="1011314117" name="Picture 1"/>
+            <wp:cNvGraphicFramePr>
+              <a:graphicFrameLocks xmlns:a="http://schemas.openxmlformats.org/drawingml/2006/main" noChangeAspect="1"/>
+            </wp:cNvGraphicFramePr>
+            <a:graphic xmlns:a="http://schemas.openxmlformats.org/drawingml/2006/main">
+              <a:graphicData uri="http://schemas.openxmlformats.org/drawingml/2006/picture">
+                <pic:pic xmlns:pic="http://schemas.openxmlformats.org/drawingml/2006/picture">
+                  <pic:nvPicPr>
+                    <pic:cNvPr id="1011314117" name=""/>
+                    <pic:cNvPicPr/>
+                  </pic:nvPicPr>
+                  <pic:blipFill>
+                    <a:blip r:embed="rId28"/>
+                    <a:stretch>
+                      <a:fillRect/>
+                    </a:stretch>
+                  </pic:blipFill>
+                  <pic:spPr>
+                    <a:xfrm>
+                      <a:off x="0" y="0"/>
+                      <a:ext cx="5731510" cy="1893570"/>
+                    </a:xfrm>
+                    <a:prstGeom prst="rect">
+                      <a:avLst/>
+                    </a:prstGeom>
+                  </pic:spPr>
+                </pic:pic>
+              </a:graphicData>
+            </a:graphic>
+          </wp:inline>
+        </w:drawing>
+      </w:r>
+    </w:p>
+    <w:p/>
+    <w:p>
+      <w:r>
+        <w:t>Does Python Know About Secrets?</w:t>
+      </w:r>
+      <w:r>
+        <w:br/>
+      </w:r>
+      <w:r>
+        <w:t xml:space="preserve">Exactly like </w:t>
+      </w:r>
+      <w:proofErr w:type="spellStart"/>
+      <w:r>
+        <w:t>ConfigMaps</w:t>
+      </w:r>
+      <w:proofErr w:type="spellEnd"/>
+      <w:r>
+        <w:t>...</w:t>
+      </w:r>
+      <w:r>
+        <w:rPr>
+          <w:b/>
+          <w:bCs/>
+        </w:rPr>
+        <w:t>No.</w:t>
+      </w:r>
+    </w:p>
+    <w:p>
+      <w:r>
+        <w:lastRenderedPageBreak/>
+        <w:drawing>
+          <wp:inline distT="0" distB="0" distL="0" distR="0" wp14:anchorId="4EBC7558" wp14:editId="2771CF05">
+            <wp:extent cx="5731510" cy="2785745"/>
+            <wp:effectExtent l="0" t="0" r="2540" b="0"/>
+            <wp:docPr id="2124759661" name="Picture 1"/>
+            <wp:cNvGraphicFramePr>
+              <a:graphicFrameLocks xmlns:a="http://schemas.openxmlformats.org/drawingml/2006/main" noChangeAspect="1"/>
+            </wp:cNvGraphicFramePr>
+            <a:graphic xmlns:a="http://schemas.openxmlformats.org/drawingml/2006/main">
+              <a:graphicData uri="http://schemas.openxmlformats.org/drawingml/2006/picture">
+                <pic:pic xmlns:pic="http://schemas.openxmlformats.org/drawingml/2006/picture">
+                  <pic:nvPicPr>
+                    <pic:cNvPr id="2124759661" name=""/>
+                    <pic:cNvPicPr/>
+                  </pic:nvPicPr>
+                  <pic:blipFill>
+                    <a:blip r:embed="rId29"/>
+                    <a:stretch>
+                      <a:fillRect/>
+                    </a:stretch>
+                  </pic:blipFill>
+                  <pic:spPr>
+                    <a:xfrm>
+                      <a:off x="0" y="0"/>
+                      <a:ext cx="5731510" cy="2785745"/>
+                    </a:xfrm>
+                    <a:prstGeom prst="rect">
+                      <a:avLst/>
+                    </a:prstGeom>
+                  </pic:spPr>
+                </pic:pic>
+              </a:graphicData>
+            </a:graphic>
+          </wp:inline>
+        </w:drawing>
+      </w:r>
+      <w:r>
+        <w:br/>
+      </w:r>
+      <w:r>
+        <w:drawing>
+          <wp:inline distT="0" distB="0" distL="0" distR="0" wp14:anchorId="6481CBBF" wp14:editId="54E32852">
+            <wp:extent cx="5731510" cy="4251960"/>
+            <wp:effectExtent l="0" t="0" r="2540" b="0"/>
+            <wp:docPr id="1887306773" name="Picture 1"/>
+            <wp:cNvGraphicFramePr>
+              <a:graphicFrameLocks xmlns:a="http://schemas.openxmlformats.org/drawingml/2006/main" noChangeAspect="1"/>
+            </wp:cNvGraphicFramePr>
+            <a:graphic xmlns:a="http://schemas.openxmlformats.org/drawingml/2006/main">
+              <a:graphicData uri="http://schemas.openxmlformats.org/drawingml/2006/picture">
+                <pic:pic xmlns:pic="http://schemas.openxmlformats.org/drawingml/2006/picture">
+                  <pic:nvPicPr>
+                    <pic:cNvPr id="1887306773" name=""/>
+                    <pic:cNvPicPr/>
+                  </pic:nvPicPr>
+                  <pic:blipFill>
+                    <a:blip r:embed="rId30"/>
+                    <a:stretch>
+                      <a:fillRect/>
+                    </a:stretch>
+                  </pic:blipFill>
+                  <pic:spPr>
+                    <a:xfrm>
+                      <a:off x="0" y="0"/>
+                      <a:ext cx="5731510" cy="4251960"/>
+                    </a:xfrm>
+                    <a:prstGeom prst="rect">
+                      <a:avLst/>
+                    </a:prstGeom>
+                  </pic:spPr>
+                </pic:pic>
+              </a:graphicData>
+            </a:graphic>
+          </wp:inline>
+        </w:drawing>
+      </w:r>
+      <w:r>
+        <w:br/>
+      </w:r>
+      <w:r>
+        <w:lastRenderedPageBreak/>
+        <w:drawing>
+          <wp:inline distT="0" distB="0" distL="0" distR="0" wp14:anchorId="3A9CDD63" wp14:editId="04A885F9">
+            <wp:extent cx="5731510" cy="3890645"/>
+            <wp:effectExtent l="0" t="0" r="2540" b="0"/>
+            <wp:docPr id="1447835789" name="Picture 1"/>
+            <wp:cNvGraphicFramePr>
+              <a:graphicFrameLocks xmlns:a="http://schemas.openxmlformats.org/drawingml/2006/main" noChangeAspect="1"/>
+            </wp:cNvGraphicFramePr>
+            <a:graphic xmlns:a="http://schemas.openxmlformats.org/drawingml/2006/main">
+              <a:graphicData uri="http://schemas.openxmlformats.org/drawingml/2006/picture">
+                <pic:pic xmlns:pic="http://schemas.openxmlformats.org/drawingml/2006/picture">
+                  <pic:nvPicPr>
+                    <pic:cNvPr id="1447835789" name=""/>
+                    <pic:cNvPicPr/>
+                  </pic:nvPicPr>
+                  <pic:blipFill>
+                    <a:blip r:embed="rId31"/>
+                    <a:stretch>
+                      <a:fillRect/>
+                    </a:stretch>
+                  </pic:blipFill>
+                  <pic:spPr>
+                    <a:xfrm>
+                      <a:off x="0" y="0"/>
+                      <a:ext cx="5731510" cy="3890645"/>
+                    </a:xfrm>
+                    <a:prstGeom prst="rect">
+                      <a:avLst/>
+                    </a:prstGeom>
+                  </pic:spPr>
+                </pic:pic>
+              </a:graphicData>
+            </a:graphic>
+          </wp:inline>
+        </w:drawing>
+      </w:r>
+    </w:p>
+    <w:p>
+      <w:r>
+        <w:lastRenderedPageBreak/>
+        <w:drawing>
+          <wp:inline distT="0" distB="0" distL="0" distR="0" wp14:anchorId="76E55B4B" wp14:editId="35F25A01">
+            <wp:extent cx="5731510" cy="3038475"/>
+            <wp:effectExtent l="0" t="0" r="2540" b="9525"/>
+            <wp:docPr id="15435784" name="Picture 1"/>
+            <wp:cNvGraphicFramePr>
+              <a:graphicFrameLocks xmlns:a="http://schemas.openxmlformats.org/drawingml/2006/main" noChangeAspect="1"/>
+            </wp:cNvGraphicFramePr>
+            <a:graphic xmlns:a="http://schemas.openxmlformats.org/drawingml/2006/main">
+              <a:graphicData uri="http://schemas.openxmlformats.org/drawingml/2006/picture">
+                <pic:pic xmlns:pic="http://schemas.openxmlformats.org/drawingml/2006/picture">
+                  <pic:nvPicPr>
+                    <pic:cNvPr id="15435784" name=""/>
+                    <pic:cNvPicPr/>
+                  </pic:nvPicPr>
+                  <pic:blipFill>
+                    <a:blip r:embed="rId32"/>
+                    <a:stretch>
+                      <a:fillRect/>
+                    </a:stretch>
+                  </pic:blipFill>
+                  <pic:spPr>
+                    <a:xfrm>
+                      <a:off x="0" y="0"/>
+                      <a:ext cx="5731510" cy="3038475"/>
+                    </a:xfrm>
+                    <a:prstGeom prst="rect">
+                      <a:avLst/>
+                    </a:prstGeom>
+                  </pic:spPr>
+                </pic:pic>
+              </a:graphicData>
+            </a:graphic>
+          </wp:inline>
+        </w:drawing>
+      </w:r>
+      <w:r>
+        <w:br/>
+      </w:r>
+      <w:r>
+        <w:drawing>
+          <wp:inline distT="0" distB="0" distL="0" distR="0" wp14:anchorId="1B1EB506" wp14:editId="25E307D0">
+            <wp:extent cx="5731510" cy="2088515"/>
+            <wp:effectExtent l="0" t="0" r="2540" b="6985"/>
+            <wp:docPr id="1377841451" name="Picture 1"/>
+            <wp:cNvGraphicFramePr>
+              <a:graphicFrameLocks xmlns:a="http://schemas.openxmlformats.org/drawingml/2006/main" noChangeAspect="1"/>
+            </wp:cNvGraphicFramePr>
+            <a:graphic xmlns:a="http://schemas.openxmlformats.org/drawingml/2006/main">
+              <a:graphicData uri="http://schemas.openxmlformats.org/drawingml/2006/picture">
+                <pic:pic xmlns:pic="http://schemas.openxmlformats.org/drawingml/2006/picture">
+                  <pic:nvPicPr>
+                    <pic:cNvPr id="1377841451" name=""/>
+                    <pic:cNvPicPr/>
+                  </pic:nvPicPr>
+                  <pic:blipFill>
+                    <a:blip r:embed="rId33"/>
+                    <a:stretch>
+                      <a:fillRect/>
+                    </a:stretch>
+                  </pic:blipFill>
+                  <pic:spPr>
+                    <a:xfrm>
+                      <a:off x="0" y="0"/>
+                      <a:ext cx="5731510" cy="2088515"/>
+                    </a:xfrm>
+                    <a:prstGeom prst="rect">
+                      <a:avLst/>
+                    </a:prstGeom>
+                  </pic:spPr>
+                </pic:pic>
+              </a:graphicData>
+            </a:graphic>
+          </wp:inline>
+        </w:drawing>
+      </w:r>
+      <w:r>
+        <w:br/>
+      </w:r>
+      <w:r>
+        <w:drawing>
+          <wp:inline distT="0" distB="0" distL="0" distR="0" wp14:anchorId="066959AB" wp14:editId="13C2E3FB">
+            <wp:extent cx="5731510" cy="3081655"/>
+            <wp:effectExtent l="0" t="0" r="2540" b="4445"/>
+            <wp:docPr id="1715691013" name="Picture 1"/>
+            <wp:cNvGraphicFramePr>
+              <a:graphicFrameLocks xmlns:a="http://schemas.openxmlformats.org/drawingml/2006/main" noChangeAspect="1"/>
+            </wp:cNvGraphicFramePr>
+            <a:graphic xmlns:a="http://schemas.openxmlformats.org/drawingml/2006/main">
+              <a:graphicData uri="http://schemas.openxmlformats.org/drawingml/2006/picture">
+                <pic:pic xmlns:pic="http://schemas.openxmlformats.org/drawingml/2006/picture">
+                  <pic:nvPicPr>
+                    <pic:cNvPr id="1715691013" name=""/>
+                    <pic:cNvPicPr/>
+                  </pic:nvPicPr>
+                  <pic:blipFill>
+                    <a:blip r:embed="rId34"/>
+                    <a:stretch>
+                      <a:fillRect/>
+                    </a:stretch>
+                  </pic:blipFill>
+                  <pic:spPr>
+                    <a:xfrm>
+                      <a:off x="0" y="0"/>
+                      <a:ext cx="5731510" cy="3081655"/>
+                    </a:xfrm>
+                    <a:prstGeom prst="rect">
+                      <a:avLst/>
+                    </a:prstGeom>
+                  </pic:spPr>
+                </pic:pic>
+              </a:graphicData>
+            </a:graphic>
+          </wp:inline>
+        </w:drawing>
+      </w:r>
+      <w:r>
+        <w:br/>
+      </w:r>
+    </w:p>
+    <w:p>
+      <w:r>
+        <w:lastRenderedPageBreak/>
+        <w:drawing>
+          <wp:inline distT="0" distB="0" distL="0" distR="0" wp14:anchorId="604231D5" wp14:editId="667E9417">
+            <wp:extent cx="4001058" cy="4467849"/>
+            <wp:effectExtent l="0" t="0" r="0" b="9525"/>
+            <wp:docPr id="1605343250" name="Picture 1"/>
+            <wp:cNvGraphicFramePr>
+              <a:graphicFrameLocks xmlns:a="http://schemas.openxmlformats.org/drawingml/2006/main" noChangeAspect="1"/>
+            </wp:cNvGraphicFramePr>
+            <a:graphic xmlns:a="http://schemas.openxmlformats.org/drawingml/2006/main">
+              <a:graphicData uri="http://schemas.openxmlformats.org/drawingml/2006/picture">
+                <pic:pic xmlns:pic="http://schemas.openxmlformats.org/drawingml/2006/picture">
+                  <pic:nvPicPr>
+                    <pic:cNvPr id="1605343250" name=""/>
+                    <pic:cNvPicPr/>
+                  </pic:nvPicPr>
+                  <pic:blipFill>
+                    <a:blip r:embed="rId35"/>
+                    <a:stretch>
+                      <a:fillRect/>
+                    </a:stretch>
+                  </pic:blipFill>
+                  <pic:spPr>
+                    <a:xfrm>
+                      <a:off x="0" y="0"/>
+                      <a:ext cx="4001058" cy="4467849"/>
+                    </a:xfrm>
+                    <a:prstGeom prst="rect">
+                      <a:avLst/>
+                    </a:prstGeom>
+                  </pic:spPr>
+                </pic:pic>
+              </a:graphicData>
+            </a:graphic>
+          </wp:inline>
+        </w:drawing>
+      </w:r>
+      <w:r>
+        <w:br/>
+      </w:r>
+      <w:r>
+        <w:lastRenderedPageBreak/>
+        <w:drawing>
+          <wp:inline distT="0" distB="0" distL="0" distR="0" wp14:anchorId="34E947AD" wp14:editId="746F8000">
+            <wp:extent cx="4182059" cy="4972744"/>
+            <wp:effectExtent l="0" t="0" r="9525" b="0"/>
+            <wp:docPr id="1728604158" name="Picture 1"/>
+            <wp:cNvGraphicFramePr>
+              <a:graphicFrameLocks xmlns:a="http://schemas.openxmlformats.org/drawingml/2006/main" noChangeAspect="1"/>
+            </wp:cNvGraphicFramePr>
+            <a:graphic xmlns:a="http://schemas.openxmlformats.org/drawingml/2006/main">
+              <a:graphicData uri="http://schemas.openxmlformats.org/drawingml/2006/picture">
+                <pic:pic xmlns:pic="http://schemas.openxmlformats.org/drawingml/2006/picture">
+                  <pic:nvPicPr>
+                    <pic:cNvPr id="1728604158" name=""/>
+                    <pic:cNvPicPr/>
+                  </pic:nvPicPr>
+                  <pic:blipFill>
+                    <a:blip r:embed="rId36"/>
+                    <a:stretch>
+                      <a:fillRect/>
+                    </a:stretch>
+                  </pic:blipFill>
+                  <pic:spPr>
+                    <a:xfrm>
+                      <a:off x="0" y="0"/>
+                      <a:ext cx="4182059" cy="4972744"/>
+                    </a:xfrm>
+                    <a:prstGeom prst="rect">
+                      <a:avLst/>
+                    </a:prstGeom>
+                  </pic:spPr>
+                </pic:pic>
+              </a:graphicData>
+            </a:graphic>
+          </wp:inline>
+        </w:drawing>
+      </w:r>
+    </w:p>
+    <w:p>
+      <w:r>
+        <w:br/>
+        <w:t>````````````````````````````````````````````````````````````````</w:t>
+      </w:r>
+    </w:p>
+    <w:p>
+      <w:pPr>
+        <w:rPr>
+          <w:b/>
+          <w:bCs/>
+        </w:rPr>
+      </w:pPr>
+      <w:r>
+        <w:rPr>
+          <w:b/>
+          <w:bCs/>
+        </w:rPr>
+        <w:t>Liveness</w:t>
+      </w:r>
+    </w:p>
+    <w:p>
+      <w:r>
+        <w:t>Are you alive?</w:t>
+      </w:r>
+    </w:p>
+    <w:p>
+      <w:r>
+        <w:t>Possible answers:</w:t>
+      </w:r>
+    </w:p>
+    <w:p>
+      <w:r>
+        <w:t>YES</w:t>
+      </w:r>
+    </w:p>
+    <w:p>
+      <w:r>
+        <w:t>NO</w:t>
+      </w:r>
+    </w:p>
+    <w:p>
+      <w:r>
+        <w:t>If NO...</w:t>
+      </w:r>
+    </w:p>
+    <w:p>
+      <w:r>
+        <w:t>Kubernetes says:</w:t>
+      </w:r>
+      <w:r>
+        <w:t xml:space="preserve">  </w:t>
+      </w:r>
+      <w:r>
+        <w:t>Restart the container.</w:t>
+      </w:r>
+    </w:p>
+    <w:p/>
+    <w:p/>
+    <w:p>
+      <w:pPr>
+        <w:rPr>
+          <w:b/>
+          <w:bCs/>
+        </w:rPr>
+      </w:pPr>
+      <w:r>
+        <w:rPr>
+          <w:b/>
+          <w:bCs/>
+        </w:rPr>
+        <w:t>Readiness</w:t>
+      </w:r>
+    </w:p>
+    <w:p>
+      <w:r>
+        <w:lastRenderedPageBreak/>
+        <w:t>Can you receive traffic?</w:t>
+      </w:r>
+    </w:p>
+    <w:p>
+      <w:r>
+        <w:t>Possible answers:</w:t>
+      </w:r>
+    </w:p>
+    <w:p>
+      <w:r>
+        <w:t>YES</w:t>
+      </w:r>
+    </w:p>
+    <w:p>
+      <w:r>
+        <w:t>NO</w:t>
+      </w:r>
+    </w:p>
+    <w:p>
+      <w:r>
+        <w:t>If NO...</w:t>
+      </w:r>
+    </w:p>
+    <w:p>
+      <w:r>
+        <w:t>Kubernetes says:</w:t>
+      </w:r>
+    </w:p>
+    <w:p>
+      <w:r>
+        <w:t>Don't restart.</w:t>
+      </w:r>
+      <w:r>
+        <w:t xml:space="preserve"> </w:t>
+      </w:r>
+      <w:r>
+        <w:t>Just stop sending requests.</w:t>
+      </w:r>
+    </w:p>
+    <w:p>
+      <w:pPr>
+        <w:rPr>
+          <w:b/>
+          <w:bCs/>
+        </w:rPr>
+      </w:pPr>
+      <w:r>
+        <w:rPr>
+          <w:b/>
+          <w:bCs/>
+        </w:rPr>
+        <w:t>Huge difference.</w:t>
+      </w:r>
+    </w:p>
+    <w:p>
+      <w:r>
+        <w:t>````````````````````````````````````````````````````````````````````</w:t>
+      </w:r>
+    </w:p>
+    <w:p/>
+    <w:p>
+      <w:r>
+        <w:lastRenderedPageBreak/>
+        <w:drawing>
+          <wp:inline distT="0" distB="0" distL="0" distR="0" wp14:anchorId="3D6717F5" wp14:editId="370EEB05">
+            <wp:extent cx="4848902" cy="5858693"/>
+            <wp:effectExtent l="0" t="0" r="8890" b="8890"/>
+            <wp:docPr id="2082855252" name="Picture 1"/>
+            <wp:cNvGraphicFramePr>
+              <a:graphicFrameLocks xmlns:a="http://schemas.openxmlformats.org/drawingml/2006/main" noChangeAspect="1"/>
+            </wp:cNvGraphicFramePr>
+            <a:graphic xmlns:a="http://schemas.openxmlformats.org/drawingml/2006/main">
+              <a:graphicData uri="http://schemas.openxmlformats.org/drawingml/2006/picture">
+                <pic:pic xmlns:pic="http://schemas.openxmlformats.org/drawingml/2006/picture">
+                  <pic:nvPicPr>
+                    <pic:cNvPr id="2082855252" name=""/>
+                    <pic:cNvPicPr/>
+                  </pic:nvPicPr>
+                  <pic:blipFill>
+                    <a:blip r:embed="rId37"/>
+                    <a:stretch>
+                      <a:fillRect/>
+                    </a:stretch>
+                  </pic:blipFill>
+                  <pic:spPr>
+                    <a:xfrm>
+                      <a:off x="0" y="0"/>
+                      <a:ext cx="4848902" cy="5858693"/>
+                    </a:xfrm>
+                    <a:prstGeom prst="rect">
+                      <a:avLst/>
+                    </a:prstGeom>
+                  </pic:spPr>
+                </pic:pic>
+              </a:graphicData>
+            </a:graphic>
+          </wp:inline>
+        </w:drawing>
+      </w:r>
+    </w:p>
+    <w:p>
+      <w:r>
+        <w:lastRenderedPageBreak/>
+        <w:drawing>
+          <wp:inline distT="0" distB="0" distL="0" distR="0" wp14:anchorId="7928F4AD" wp14:editId="333F94F3">
+            <wp:extent cx="5344271" cy="6630325"/>
+            <wp:effectExtent l="0" t="0" r="8890" b="0"/>
+            <wp:docPr id="558024960" name="Picture 1"/>
+            <wp:cNvGraphicFramePr>
+              <a:graphicFrameLocks xmlns:a="http://schemas.openxmlformats.org/drawingml/2006/main" noChangeAspect="1"/>
+            </wp:cNvGraphicFramePr>
+            <a:graphic xmlns:a="http://schemas.openxmlformats.org/drawingml/2006/main">
+              <a:graphicData uri="http://schemas.openxmlformats.org/drawingml/2006/picture">
+                <pic:pic xmlns:pic="http://schemas.openxmlformats.org/drawingml/2006/picture">
+                  <pic:nvPicPr>
+                    <pic:cNvPr id="558024960" name=""/>
+                    <pic:cNvPicPr/>
+                  </pic:nvPicPr>
+                  <pic:blipFill>
+                    <a:blip r:embed="rId38"/>
+                    <a:stretch>
+                      <a:fillRect/>
+                    </a:stretch>
+                  </pic:blipFill>
+                  <pic:spPr>
+                    <a:xfrm>
+                      <a:off x="0" y="0"/>
+                      <a:ext cx="5344271" cy="6630325"/>
+                    </a:xfrm>
+                    <a:prstGeom prst="rect">
+                      <a:avLst/>
+                    </a:prstGeom>
+                  </pic:spPr>
+                </pic:pic>
+              </a:graphicData>
+            </a:graphic>
+          </wp:inline>
+        </w:drawing>
+      </w:r>
+      <w:r>
+        <w:br/>
+      </w:r>
+      <w:r>
+        <w:t>The Pod is still running.</w:t>
+      </w:r>
+      <w:r>
+        <w:t xml:space="preserve"> </w:t>
+      </w:r>
+      <w:r>
+        <w:t>It simply isn't receiving traffic.</w:t>
+      </w:r>
+    </w:p>
+    <w:p/>
+    <w:p>
+      <w:r>
+        <w:t>```````````````````````````````````````````````````````````````````</w:t>
+      </w:r>
+    </w:p>
+    <w:p/>
+    <w:p>
+      <w:r>
+        <w:t>Think About Your Project</w:t>
+      </w:r>
+      <w:r>
+        <w:br/>
+      </w:r>
+      <w:r>
+        <w:t>You currently have:</w:t>
+      </w:r>
+    </w:p>
+    <w:p>
+      <w:r>
+        <w:lastRenderedPageBreak/>
+        <w:br/>
+      </w:r>
+      <w:r>
+        <w:t>User Service</w:t>
+      </w:r>
+      <w:r>
+        <w:br/>
+      </w:r>
+      <w:r>
+        <w:t>3 Pods</w:t>
+      </w:r>
+    </w:p>
+    <w:p/>
+    <w:p>
+      <w:r>
+        <w:t>Imagine:</w:t>
+      </w:r>
+      <w:r>
+        <w:br/>
+      </w:r>
+      <w:r>
+        <w:t>Pod A</w:t>
+      </w:r>
+      <w:r>
+        <w:br/>
+      </w:r>
+      <w:r>
+        <w:t>Pod B</w:t>
+      </w:r>
+      <w:r>
+        <w:br/>
+      </w:r>
+      <w:r>
+        <w:t>Pod C</w:t>
+      </w:r>
+    </w:p>
+    <w:p/>
+    <w:p>
+      <w:r>
+        <w:t>Pod B loses database connectivity.</w:t>
+      </w:r>
+      <w:r>
+        <w:br/>
+      </w:r>
+      <w:r>
+        <w:t>Should users still be routed there?</w:t>
+      </w:r>
+      <w:r>
+        <w:br/>
+      </w:r>
+      <w:r>
+        <w:t>No.</w:t>
+      </w:r>
+    </w:p>
+    <w:p>
+      <w:proofErr w:type="gramStart"/>
+      <w:r>
+        <w:t>So</w:t>
+      </w:r>
+      <w:proofErr w:type="gramEnd"/>
+      <w:r>
+        <w:t xml:space="preserve"> Kubernetes changes this:</w:t>
+      </w:r>
+      <w:r>
+        <w:br/>
+      </w:r>
+      <w:r>
+        <w:t>Before:</w:t>
+      </w:r>
+      <w:r>
+        <w:br/>
+      </w:r>
+      <w:r>
+        <w:drawing>
+          <wp:inline distT="0" distB="0" distL="0" distR="0" wp14:anchorId="3D9A8E9A" wp14:editId="5F3D8371">
+            <wp:extent cx="5731510" cy="1508760"/>
+            <wp:effectExtent l="0" t="0" r="2540" b="0"/>
+            <wp:docPr id="1753172574" name="Picture 1"/>
+            <wp:cNvGraphicFramePr>
+              <a:graphicFrameLocks xmlns:a="http://schemas.openxmlformats.org/drawingml/2006/main" noChangeAspect="1"/>
+            </wp:cNvGraphicFramePr>
+            <a:graphic xmlns:a="http://schemas.openxmlformats.org/drawingml/2006/main">
+              <a:graphicData uri="http://schemas.openxmlformats.org/drawingml/2006/picture">
+                <pic:pic xmlns:pic="http://schemas.openxmlformats.org/drawingml/2006/picture">
+                  <pic:nvPicPr>
+                    <pic:cNvPr id="1753172574" name=""/>
+                    <pic:cNvPicPr/>
+                  </pic:nvPicPr>
+                  <pic:blipFill>
+                    <a:blip r:embed="rId39"/>
+                    <a:stretch>
+                      <a:fillRect/>
+                    </a:stretch>
+                  </pic:blipFill>
+                  <pic:spPr>
+                    <a:xfrm>
+                      <a:off x="0" y="0"/>
+                      <a:ext cx="5731510" cy="1508760"/>
+                    </a:xfrm>
+                    <a:prstGeom prst="rect">
+                      <a:avLst/>
+                    </a:prstGeom>
+                  </pic:spPr>
+                </pic:pic>
+              </a:graphicData>
+            </a:graphic>
+          </wp:inline>
+        </w:drawing>
+      </w:r>
+      <w:r>
+        <w:br/>
+        <w:t>After:</w:t>
+      </w:r>
+      <w:r>
+        <w:br/>
+      </w:r>
+      <w:r>
+        <w:drawing>
+          <wp:inline distT="0" distB="0" distL="0" distR="0" wp14:anchorId="47DB67AA" wp14:editId="06B858F2">
+            <wp:extent cx="5731510" cy="1240155"/>
+            <wp:effectExtent l="0" t="0" r="2540" b="0"/>
+            <wp:docPr id="1208821170" name="Picture 1"/>
+            <wp:cNvGraphicFramePr>
+              <a:graphicFrameLocks xmlns:a="http://schemas.openxmlformats.org/drawingml/2006/main" noChangeAspect="1"/>
+            </wp:cNvGraphicFramePr>
+            <a:graphic xmlns:a="http://schemas.openxmlformats.org/drawingml/2006/main">
+              <a:graphicData uri="http://schemas.openxmlformats.org/drawingml/2006/picture">
+                <pic:pic xmlns:pic="http://schemas.openxmlformats.org/drawingml/2006/picture">
+                  <pic:nvPicPr>
+                    <pic:cNvPr id="1208821170" name=""/>
+                    <pic:cNvPicPr/>
+                  </pic:nvPicPr>
+                  <pic:blipFill>
+                    <a:blip r:embed="rId40"/>
+                    <a:stretch>
+                      <a:fillRect/>
+                    </a:stretch>
+                  </pic:blipFill>
+                  <pic:spPr>
+                    <a:xfrm>
+                      <a:off x="0" y="0"/>
+                      <a:ext cx="5731510" cy="1240155"/>
+                    </a:xfrm>
+                    <a:prstGeom prst="rect">
+                      <a:avLst/>
+                    </a:prstGeom>
+                  </pic:spPr>
+                </pic:pic>
+              </a:graphicData>
+            </a:graphic>
+          </wp:inline>
+        </w:drawing>
+      </w:r>
+      <w:r>
+        <w:br/>
+      </w:r>
+    </w:p>
+    <w:p>
+      <w:r>
+        <w:t>Pod B stays alive.</w:t>
+      </w:r>
+      <w:r>
+        <w:t xml:space="preserve">  </w:t>
+      </w:r>
+      <w:r>
+        <w:t>It just doesn't receive requests.</w:t>
+      </w:r>
+    </w:p>
+    <w:p/>
+    <w:p>
+      <w:r>
+        <w:lastRenderedPageBreak/>
+        <w:drawing>
+          <wp:inline distT="0" distB="0" distL="0" distR="0" wp14:anchorId="3A5391B3" wp14:editId="0F0F0AE9">
+            <wp:extent cx="5731510" cy="3547110"/>
+            <wp:effectExtent l="0" t="0" r="2540" b="0"/>
+            <wp:docPr id="1001733911" name="Picture 1"/>
+            <wp:cNvGraphicFramePr>
+              <a:graphicFrameLocks xmlns:a="http://schemas.openxmlformats.org/drawingml/2006/main" noChangeAspect="1"/>
+            </wp:cNvGraphicFramePr>
+            <a:graphic xmlns:a="http://schemas.openxmlformats.org/drawingml/2006/main">
+              <a:graphicData uri="http://schemas.openxmlformats.org/drawingml/2006/picture">
+                <pic:pic xmlns:pic="http://schemas.openxmlformats.org/drawingml/2006/picture">
+                  <pic:nvPicPr>
+                    <pic:cNvPr id="1001733911" name=""/>
+                    <pic:cNvPicPr/>
+                  </pic:nvPicPr>
+                  <pic:blipFill>
+                    <a:blip r:embed="rId41"/>
+                    <a:stretch>
+                      <a:fillRect/>
+                    </a:stretch>
+                  </pic:blipFill>
+                  <pic:spPr>
+                    <a:xfrm>
+                      <a:off x="0" y="0"/>
+                      <a:ext cx="5731510" cy="3547110"/>
+                    </a:xfrm>
+                    <a:prstGeom prst="rect">
+                      <a:avLst/>
+                    </a:prstGeom>
+                  </pic:spPr>
+                </pic:pic>
+              </a:graphicData>
+            </a:graphic>
+          </wp:inline>
+        </w:drawing>
+      </w:r>
+    </w:p>
+    <w:p/>
+    <w:p/>
+    <w:p/>
+    <w:p/>
+    <w:p/>
+    <w:p/>
     <w:sectPr>
       <w:pgSz w:w="11906" w:h="16838"/>
       <w:pgMar w:top="1440" w:right="1440" w:bottom="1440" w:left="1440" w:header="708" w:footer="708" w:gutter="0"/>

</xml_diff>